<commit_message>
Treina o modelo CNN real e substitui o stub
O notebook rodou no Colab e o modelo/classes.json passou de stub
(pesos aleatorios) para o MobileNetV2 real, com 97.07% de acuracia
no conjunto de teste.

- Adiciona fallback de download (Drive/upload manual) e fix de
  protobuf no notebook de treino, para quando o Mendeley bloqueia
  downloads automatizados
- Gera graficos e metricas de treino em docs/
- Adiciona fotos de exemplo por classe em dados/exemplos/
- Atualiza o relatorio com os resultados reais do treino

Co-Authored-By: Claude Sonnet 5 <noreply@anthropic.com>
</commit_message>
<xml_diff>
--- a/relatorio/paulo_sergio_morais_RM553012_3ESOR_fase1_atividade.docx
+++ b/relatorio/paulo_sergio_morais_RM553012_3ESOR_fase1_atividade.docx
@@ -1521,7 +1521,7 @@
           <w:sz w:val="21"/>
           <w:szCs w:val="21"/>
         </w:rPr>
-        <w:t xml:space="preserve">O treino usa transferência de aprendizado: MobileNetV2 pré-treinado no ImageNet, com a base congelada e um topo novo treinado sobre as 12 classes. A arquitetura foi escolhida pelo tamanho — cerca de 14 MB — que permite distribuir o modelo junto com o código e rodar a inferência em CPU, sem GPU e sem servidor.</w:t>
+        <w:t xml:space="preserve">O treino usa transferência de aprendizado: MobileNetV2 pré-treinado no ImageNet, com a base congelada e um topo novo treinado sobre as 12 classes. A arquitetura foi escolhida pelo tamanho — cerca de 22 MB, já com a base ajustada na fase de fine-tuning — que permite distribuir o modelo junto com o código e rodar a inferência em CPU, sem GPU e sem servidor.</w:t>
       </w:r>
     </w:p>
     <w:p>
@@ -6116,6 +6116,57 @@
     <w:p>
       <w:pPr>
         <w:pBdr>
+          <w:left w:val="single" w:color="1F6B3B" w:sz="18" w:space="8"/>
+        </w:pBdr>
+        <w:shd w:fill="E8F5EC" w:val="clear"/>
+        <w:spacing w:after="0" w:before="200"/>
+        <w:ind w:left="160" w:right="160"/>
+      </w:pPr>
+      <w:r>
+        <w:rPr>
+          <w:b/>
+          <w:bCs/>
+          <w:color w:val="1F6B3B"/>
+          <w:sz w:val="20"/>
+          <w:szCs w:val="20"/>
+        </w:rPr>
+        <w:t xml:space="preserve">Modelo treinado — pendência resolvida</w:t>
+      </w:r>
+    </w:p>
+    <w:p>
+      <w:pPr>
+        <w:pBdr>
+          <w:left w:val="single" w:color="1F6B3B" w:sz="18" w:space="8"/>
+        </w:pBdr>
+        <w:shd w:fill="E8F5EC" w:val="clear"/>
+        <w:spacing w:after="200" w:before="40"/>
+        <w:ind w:left="160" w:right="160"/>
+      </w:pPr>
+      <w:r>
+        <w:rPr>
+          <w:color w:val="3A3A33"/>
+          <w:sz w:val="20"/>
+          <w:szCs w:val="20"/>
+        </w:rPr>
+        <w:t xml:space="preserve">O notebook notebooks/treino_agrosmart.ipynb rodou no Google Colab (MobileNetV2, transferência de aprendizado, base congelada seguida de ajuste fino) e substituiu o stub pelo modelo real. O campo acuracia_teste em modelo/classes.json saiu de nulo para 0,9707.</w:t>
+      </w:r>
+    </w:p>
+    <w:p>
+      <w:pPr>
+        <w:spacing w:after="200" w:line="276"/>
+      </w:pPr>
+      <w:r>
+        <w:rPr>
+          <w:color w:val="222826"/>
+          <w:sz w:val="21"/>
+          <w:szCs w:val="21"/>
+        </w:rPr>
+        <w:t xml:space="preserve">Acurácia global no conjunto de teste: 97,07% (2.151 imagens nunca vistas pelo modelo, de um total de 14.331 imagens filtradas — 10.029 usadas no treino). Por classe, o F1-score varia de 91,3% (batata-saudável) a 100% (milho-saudável, milho-ferrugem comum e uva-podridão-negra). A matriz de confusão e a curva de aprendizado — fase A com a base congelada, fase B com ajuste fino — estão em docs/matriz_confusao.png e docs/curvas_treino.png; os números completos por classe, em docs/metricas.json.</w:t>
+      </w:r>
+    </w:p>
+    <w:p>
+      <w:pPr>
+        <w:pBdr>
           <w:left w:val="single" w:color="B36B00" w:sz="18" w:space="8"/>
         </w:pBdr>
         <w:shd w:fill="FFF6E5" w:val="clear"/>
@@ -6130,7 +6181,7 @@
           <w:sz w:val="20"/>
           <w:szCs w:val="20"/>
         </w:rPr>
-        <w:t xml:space="preserve">Pendência a resolver antes da entrega final</w:t>
+        <w:t xml:space="preserve">Pendências restantes antes da entrega</w:t>
       </w:r>
     </w:p>
     <w:p>
@@ -6148,20 +6199,7 @@
           <w:sz w:val="20"/>
           <w:szCs w:val="20"/>
         </w:rPr>
-        <w:t xml:space="preserve">O arquivo em modelo/ é atualmente um stub de arquitetura idêntica com o topo inicializado aleatoriamente, gerado para desenvolver a aplicação sem depender do treino. Enquanto ele estiver ali, as predições do motor CNN são aleatórias e o campo acuracia_teste permanece nulo. Rodar notebooks/treino_agrosmart.ipynb no Colab (20 a 30 minutos em GPU T4) substitui o stub pelo modelo real e gera as métricas e os gráficos que completam a seção 3.2 e esta seção.</w:t>
-      </w:r>
-    </w:p>
-    <w:p>
-      <w:pPr>
-        <w:spacing w:after="200" w:line="276"/>
-      </w:pPr>
-      <w:r>
-        <w:rPr>
-          <w:color w:val="222826"/>
-          <w:sz w:val="21"/>
-          <w:szCs w:val="21"/>
-        </w:rPr>
-        <w:t xml:space="preserve">Concluído o treino, entram neste relatório: a acurácia global no conjunto de teste, a acurácia por classe, a matriz de confusão e a curva de aprendizado — além da comparação direta entre os dois motores sobre o mesmo conjunto de fotos de campo, que é a contribuição própria deste trabalho.</w:t>
+        <w:t xml:space="preserve">Faltam duas capturas de tela do app em funcionamento, pedidas na seção 5.1. E falta a comparação direta entre os dois motores sobre fotos de campo reais: dados/campo/ está vazia — precisa de 10 a 15 fotos tiradas pela equipe, com o diagnóstico verdadeiro anotado, para rodar classificar_pasta.py dados/campo --motor comparacao e produzir os números que completam esta seção.</w:t>
       </w:r>
     </w:p>
     <w:p>

</xml_diff>